<commit_message>
Fix Swagger demo login panel mounting
</commit_message>
<xml_diff>
--- a/VOYA_Client_Facing_Architecture_API_DB_Demo.docx
+++ b/VOYA_Client_Facing_Architecture_API_DB_Demo.docx
@@ -7943,6 +7943,457 @@
         <w:t>The dropdown and direct login button are designed for the configured demo personas only. Passwords are sourced from deployment environment variables, are not committed to the repository, and are not included in this document. Preview is read-only. Final create, cancellation and other write operations must be executed only when the demo owner intends to change production state.</w:t>
       </w:r>
     </w:p>
+    <w:p>
+      <w:pPr>
+        <w:pStyle w:val="Heading1"/>
+      </w:pPr>
+      <w:r>
+        <w:t>20 Production Verification Captured</w:t>
+      </w:r>
+    </w:p>
+    <w:p>
+      <w:r>
+        <w:t>This section records the live checks completed on 13 September 2026 after deployment of commit afc9b63 to the main branch. Passwords, access tokens, and private fingerprints are intentionally not included in this document.</w:t>
+      </w:r>
+    </w:p>
+    <w:tbl>
+      <w:tblPr>
+        <w:tblStyle w:val="TableGrid"/>
+        <w:tblW w:type="auto" w:w="0"/>
+        <w:tblLook w:firstColumn="1" w:firstRow="1" w:lastColumn="0" w:lastRow="0" w:noHBand="0" w:noVBand="1" w:val="04A0"/>
+      </w:tblPr>
+      <w:tblGrid>
+        <w:gridCol w:w="3408"/>
+        <w:gridCol w:w="3408"/>
+        <w:gridCol w:w="3408"/>
+      </w:tblGrid>
+      <w:tr>
+        <w:trPr>
+          <w:tblHeader/>
+        </w:trPr>
+        <w:tc>
+          <w:tcPr>
+            <w:tcW w:type="dxa" w:w="3408"/>
+          </w:tcPr>
+          <w:p>
+            <w:r>
+              <w:t>Check</w:t>
+            </w:r>
+          </w:p>
+        </w:tc>
+        <w:tc>
+          <w:tcPr>
+            <w:tcW w:type="dxa" w:w="3408"/>
+          </w:tcPr>
+          <w:p>
+            <w:r>
+              <w:t>Result</w:t>
+            </w:r>
+          </w:p>
+        </w:tc>
+        <w:tc>
+          <w:tcPr>
+            <w:tcW w:type="dxa" w:w="3408"/>
+          </w:tcPr>
+          <w:p>
+            <w:r>
+              <w:t>Demo meaning</w:t>
+            </w:r>
+          </w:p>
+        </w:tc>
+      </w:tr>
+      <w:tr>
+        <w:tc>
+          <w:tcPr>
+            <w:tcW w:type="dxa" w:w="3408"/>
+          </w:tcPr>
+          <w:p>
+            <w:r>
+              <w:t>GET /voya/api/health</w:t>
+            </w:r>
+          </w:p>
+        </w:tc>
+        <w:tc>
+          <w:tcPr>
+            <w:tcW w:type="dxa" w:w="3408"/>
+          </w:tcPr>
+          <w:p>
+            <w:r>
+              <w:t>200 OK</w:t>
+            </w:r>
+          </w:p>
+        </w:tc>
+        <w:tc>
+          <w:tcPr>
+            <w:tcW w:type="dxa" w:w="3408"/>
+          </w:tcPr>
+          <w:p>
+            <w:r>
+              <w:t>Production API is reachable.</w:t>
+            </w:r>
+          </w:p>
+        </w:tc>
+      </w:tr>
+      <w:tr>
+        <w:tc>
+          <w:tcPr>
+            <w:tcW w:type="dxa" w:w="3408"/>
+          </w:tcPr>
+          <w:p>
+            <w:r>
+              <w:t>GET /voya/api/docs</w:t>
+            </w:r>
+          </w:p>
+        </w:tc>
+        <w:tc>
+          <w:tcPr>
+            <w:tcW w:type="dxa" w:w="3408"/>
+          </w:tcPr>
+          <w:p>
+            <w:r>
+              <w:t>200 OK</w:t>
+            </w:r>
+          </w:p>
+        </w:tc>
+        <w:tc>
+          <w:tcPr>
+            <w:tcW w:type="dxa" w:w="3408"/>
+          </w:tcPr>
+          <w:p>
+            <w:r>
+              <w:t>Swagger UI is published.</w:t>
+            </w:r>
+          </w:p>
+        </w:tc>
+      </w:tr>
+      <w:tr>
+        <w:tc>
+          <w:tcPr>
+            <w:tcW w:type="dxa" w:w="3408"/>
+          </w:tcPr>
+          <w:p>
+            <w:r>
+              <w:t>GET /voya/api/docs/demo-login.js</w:t>
+            </w:r>
+          </w:p>
+        </w:tc>
+        <w:tc>
+          <w:tcPr>
+            <w:tcW w:type="dxa" w:w="3408"/>
+          </w:tcPr>
+          <w:p>
+            <w:r>
+              <w:t>200 OK</w:t>
+            </w:r>
+          </w:p>
+        </w:tc>
+        <w:tc>
+          <w:tcPr>
+            <w:tcW w:type="dxa" w:w="3408"/>
+          </w:tcPr>
+          <w:p>
+            <w:r>
+              <w:t>Role dropdown and login helper are published.</w:t>
+            </w:r>
+          </w:p>
+        </w:tc>
+      </w:tr>
+      <w:tr>
+        <w:tc>
+          <w:tcPr>
+            <w:tcW w:type="dxa" w:w="3408"/>
+          </w:tcPr>
+          <w:p>
+            <w:r>
+              <w:t>Vendor / Travel Agent / Admin login + /auth/me</w:t>
+            </w:r>
+          </w:p>
+        </w:tc>
+        <w:tc>
+          <w:tcPr>
+            <w:tcW w:type="dxa" w:w="3408"/>
+          </w:tcPr>
+          <w:p>
+            <w:r>
+              <w:t>201 + 200 for all three</w:t>
+            </w:r>
+          </w:p>
+        </w:tc>
+        <w:tc>
+          <w:tcPr>
+            <w:tcW w:type="dxa" w:w="3408"/>
+          </w:tcPr>
+          <w:p>
+            <w:r>
+              <w:t>Each role can authenticate and receive the correct role context.</w:t>
+            </w:r>
+          </w:p>
+        </w:tc>
+      </w:tr>
+      <w:tr>
+        <w:tc>
+          <w:tcPr>
+            <w:tcW w:type="dxa" w:w="3408"/>
+          </w:tcPr>
+          <w:p>
+            <w:r>
+              <w:t>POST /voya/api/marketplace/search</w:t>
+            </w:r>
+          </w:p>
+        </w:tc>
+        <w:tc>
+          <w:tcPr>
+            <w:tcW w:type="dxa" w:w="3408"/>
+          </w:tcPr>
+          <w:p>
+            <w:r>
+              <w:t>200 OK; count 1</w:t>
+            </w:r>
+          </w:p>
+        </w:tc>
+        <w:tc>
+          <w:tcPr>
+            <w:tcW w:type="dxa" w:w="3408"/>
+          </w:tcPr>
+          <w:p>
+            <w:r>
+              <w:t>Canonical live product ACT-F7C5F1E9 returned with two available offers.</w:t>
+            </w:r>
+          </w:p>
+        </w:tc>
+      </w:tr>
+      <w:tr>
+        <w:tc>
+          <w:tcPr>
+            <w:tcW w:type="dxa" w:w="3408"/>
+          </w:tcPr>
+          <w:p>
+            <w:r>
+              <w:t>POST /voya/api/agent/bookings/preview</w:t>
+            </w:r>
+          </w:p>
+        </w:tc>
+        <w:tc>
+          <w:tcPr>
+            <w:tcW w:type="dxa" w:w="3408"/>
+          </w:tcPr>
+          <w:p>
+            <w:r>
+              <w:t>201; eligible=true</w:t>
+            </w:r>
+          </w:p>
+        </w:tc>
+        <w:tc>
+          <w:tcPr>
+            <w:tcW w:type="dxa" w:w="3408"/>
+          </w:tcPr>
+          <w:p>
+            <w:r>
+              <w:t>Booking payload is commercially eligible without creating a booking.</w:t>
+            </w:r>
+          </w:p>
+        </w:tc>
+      </w:tr>
+    </w:tbl>
+    <w:p>
+      <w:r>
+        <w:t>Live marketplace response excerpt:</w:t>
+      </w:r>
+    </w:p>
+    <w:p>
+      <w:pPr>
+        <w:pStyle w:val="NoSpacing"/>
+      </w:pPr>
+      <w:r>
+        <w:rPr>
+          <w:rFonts w:ascii="Consolas" w:hAnsi="Consolas"/>
+          <w:sz w:val="17"/>
+        </w:rPr>
+        <w:t>POST /voya/api/marketplace/search -&gt; 200 OK</w:t>
+        <w:br/>
+      </w:r>
+      <w:r>
+        <w:rPr>
+          <w:rFonts w:ascii="Consolas" w:hAnsi="Consolas"/>
+          <w:sz w:val="17"/>
+        </w:rPr>
+        <w:t>serviceDate: 2026-09-15</w:t>
+        <w:br/>
+      </w:r>
+      <w:r>
+        <w:rPr>
+          <w:rFonts w:ascii="Consolas" w:hAnsi="Consolas"/>
+          <w:sz w:val="17"/>
+        </w:rPr>
+        <w:t>count: 1</w:t>
+        <w:br/>
+      </w:r>
+      <w:r>
+        <w:rPr>
+          <w:rFonts w:ascii="Consolas" w:hAnsi="Consolas"/>
+          <w:sz w:val="17"/>
+        </w:rPr>
+        <w:t>productCode: ACT-F7C5F1E9</w:t>
+        <w:br/>
+      </w:r>
+      <w:r>
+        <w:rPr>
+          <w:rFonts w:ascii="Consolas" w:hAnsi="Consolas"/>
+          <w:sz w:val="17"/>
+        </w:rPr>
+        <w:t>product: Sunrise Trek to Top Station</w:t>
+        <w:br/>
+      </w:r>
+      <w:r>
+        <w:rPr>
+          <w:rFonts w:ascii="Consolas" w:hAnsi="Consolas"/>
+          <w:sz w:val="17"/>
+        </w:rPr>
+        <w:t>variant: SUNRISE_SHARED_0515</w:t>
+        <w:br/>
+      </w:r>
+      <w:r>
+        <w:rPr>
+          <w:rFonts w:ascii="Consolas" w:hAnsi="Consolas"/>
+          <w:sz w:val="17"/>
+        </w:rPr>
+        <w:t>ratePlan: RP-DEMO-001 / Standard B2B</w:t>
+        <w:br/>
+      </w:r>
+      <w:r>
+        <w:rPr>
+          <w:rFonts w:ascii="Consolas" w:hAnsi="Consolas"/>
+          <w:sz w:val="17"/>
+        </w:rPr>
+        <w:t>offers: 2</w:t>
+        <w:br/>
+      </w:r>
+      <w:r>
+        <w:rPr>
+          <w:rFonts w:ascii="Consolas" w:hAnsi="Consolas"/>
+          <w:sz w:val="17"/>
+        </w:rPr>
+        <w:t>offer 1: session 75852609-3269-41b3-b2d4-6c13a23d844f, 06:00-10:00, available capacity 10</w:t>
+        <w:br/>
+      </w:r>
+      <w:r>
+        <w:rPr>
+          <w:rFonts w:ascii="Consolas" w:hAnsi="Consolas"/>
+          <w:sz w:val="17"/>
+        </w:rPr>
+        <w:t>offer 2: session 3329fc2e-4219-4e71-b002-75a11930450c, 09:30-13:30, available capacity 10</w:t>
+        <w:br/>
+      </w:r>
+      <w:r>
+        <w:rPr>
+          <w:rFonts w:ascii="Consolas" w:hAnsi="Consolas"/>
+          <w:sz w:val="17"/>
+        </w:rPr>
+        <w:t>bookingMode: INSTANT</w:t>
+        <w:br/>
+      </w:r>
+      <w:r>
+        <w:rPr>
+          <w:rFonts w:ascii="Consolas" w:hAnsi="Consolas"/>
+          <w:sz w:val="17"/>
+        </w:rPr>
+        <w:t>finalAmount: 2998.00 INR</w:t>
+      </w:r>
+    </w:p>
+    <w:p>
+      <w:r>
+        <w:t>Live booking-preview response excerpt for two adults on the 09:30 session:</w:t>
+      </w:r>
+    </w:p>
+    <w:p>
+      <w:pPr>
+        <w:pStyle w:val="NoSpacing"/>
+      </w:pPr>
+      <w:r>
+        <w:rPr>
+          <w:rFonts w:ascii="Consolas" w:hAnsi="Consolas"/>
+          <w:sz w:val="17"/>
+        </w:rPr>
+        <w:t>POST /voya/api/agent/bookings/preview -&gt; 201</w:t>
+        <w:br/>
+      </w:r>
+      <w:r>
+        <w:rPr>
+          <w:rFonts w:ascii="Consolas" w:hAnsi="Consolas"/>
+          <w:sz w:val="17"/>
+        </w:rPr>
+        <w:t>eligible: true</w:t>
+        <w:br/>
+      </w:r>
+      <w:r>
+        <w:rPr>
+          <w:rFonts w:ascii="Consolas" w:hAnsi="Consolas"/>
+          <w:sz w:val="17"/>
+        </w:rPr>
+        <w:t>bookingMode: INSTANT</w:t>
+        <w:br/>
+      </w:r>
+      <w:r>
+        <w:rPr>
+          <w:rFonts w:ascii="Consolas" w:hAnsi="Consolas"/>
+          <w:sz w:val="17"/>
+        </w:rPr>
+        <w:t>price.currency: INR</w:t>
+        <w:br/>
+      </w:r>
+      <w:r>
+        <w:rPr>
+          <w:rFonts w:ascii="Consolas" w:hAnsi="Consolas"/>
+          <w:sz w:val="17"/>
+        </w:rPr>
+        <w:t>price.finalAmount: 2998.00</w:t>
+        <w:br/>
+      </w:r>
+      <w:r>
+        <w:rPr>
+          <w:rFonts w:ascii="Consolas" w:hAnsi="Consolas"/>
+          <w:sz w:val="17"/>
+        </w:rPr>
+        <w:t>price.priceChanged: false</w:t>
+        <w:br/>
+      </w:r>
+      <w:r>
+        <w:rPr>
+          <w:rFonts w:ascii="Consolas" w:hAnsi="Consolas"/>
+          <w:sz w:val="17"/>
+        </w:rPr>
+        <w:t>capacityConsumption: 2</w:t>
+        <w:br/>
+      </w:r>
+      <w:r>
+        <w:rPr>
+          <w:rFonts w:ascii="Consolas" w:hAnsi="Consolas"/>
+          <w:sz w:val="17"/>
+        </w:rPr>
+        <w:t>questions: []</w:t>
+        <w:br/>
+      </w:r>
+      <w:r>
+        <w:rPr>
+          <w:rFonts w:ascii="Consolas" w:hAnsi="Consolas"/>
+          <w:sz w:val="17"/>
+        </w:rPr>
+        <w:t>required quote/context fingerprints: present</w:t>
+        <w:br/>
+      </w:r>
+      <w:r>
+        <w:rPr>
+          <w:rFonts w:ascii="Consolas" w:hAnsi="Consolas"/>
+          <w:sz w:val="17"/>
+        </w:rPr>
+        <w:t>write committed: no</w:t>
+      </w:r>
+    </w:p>
+    <w:p>
+      <w:r>
+        <w:t>Important demo note: GET /voya/api/products may place a newer DRAFT product first in its list. For the client-facing walkthrough, use POST /voya/api/marketplace/search with the payload in the previous section and select the returned canonical LIVE product ACT-F7C5F1E9.</w:t>
+      </w:r>
+    </w:p>
     <w:sectPr>
       <w:footerReference w:type="default" r:id="rId9"/>
       <w:pgSz w:w="12240" w:h="15840"/>

</xml_diff>